<commit_message>
Synchronize verified EEAI publication masters
</commit_message>
<xml_diff>
--- a/profile_private/Mineo_Raffaele_PublicationsList.docx
+++ b/profile_private/Mineo_Raffaele_PublicationsList.docx
@@ -132,6 +132,13 @@
       </w:r>
       <w:r>
         <w:rPr>
+          <w:color w:val="5A646E"/>
+          <w:sz w:val="16"/>
+        </w:rPr>
+        <w:t xml:space="preserve"> - UIBM</w:t>
+      </w:r>
+      <w:r>
+        <w:rPr>
           <w:color w:val="285078"/>
           <w:sz w:val="16"/>
         </w:rPr>
@@ -188,6 +195,13 @@
           <w:sz w:val="17"/>
         </w:rPr>
         <w:t xml:space="preserve"> - Patent</w:t>
+      </w:r>
+      <w:r>
+        <w:rPr>
+          <w:color w:val="5A646E"/>
+          <w:sz w:val="16"/>
+        </w:rPr>
+        <w:t xml:space="preserve"> - WO</w:t>
       </w:r>
       <w:r>
         <w:rPr>
@@ -250,6 +264,13 @@
       </w:r>
       <w:r>
         <w:rPr>
+          <w:color w:val="5A646E"/>
+          <w:sz w:val="16"/>
+        </w:rPr>
+        <w:t xml:space="preserve"> - EHJQ-QCCO</w:t>
+      </w:r>
+      <w:r>
+        <w:rPr>
           <w:color w:val="285078"/>
           <w:sz w:val="16"/>
         </w:rPr>
@@ -306,6 +327,13 @@
           <w:sz w:val="17"/>
         </w:rPr>
         <w:t xml:space="preserve"> - Journal</w:t>
+      </w:r>
+      <w:r>
+        <w:rPr>
+          <w:color w:val="5A646E"/>
+          <w:sz w:val="16"/>
+        </w:rPr>
+        <w:t xml:space="preserve"> - TMI</w:t>
       </w:r>
       <w:r>
         <w:rPr>
@@ -368,6 +396,13 @@
       </w:r>
       <w:r>
         <w:rPr>
+          <w:color w:val="5A646E"/>
+          <w:sz w:val="16"/>
+        </w:rPr>
+        <w:t xml:space="preserve"> - BIOSTEC</w:t>
+      </w:r>
+      <w:r>
+        <w:rPr>
           <w:color w:val="285078"/>
           <w:sz w:val="16"/>
         </w:rPr>
@@ -424,6 +459,13 @@
           <w:sz w:val="17"/>
         </w:rPr>
         <w:t xml:space="preserve"> - Conference</w:t>
+      </w:r>
+      <w:r>
+        <w:rPr>
+          <w:color w:val="5A646E"/>
+          <w:sz w:val="16"/>
+        </w:rPr>
+        <w:t xml:space="preserve"> - ICIAP</w:t>
       </w:r>
       <w:r>
         <w:rPr>
@@ -511,6 +553,13 @@
         </w:rPr>
         <w:t xml:space="preserve"> - Conference</w:t>
       </w:r>
+      <w:r>
+        <w:rPr>
+          <w:color w:val="5A646E"/>
+          <w:sz w:val="16"/>
+        </w:rPr>
+        <w:t xml:space="preserve"> - CVPR</w:t>
+      </w:r>
     </w:p>
     <w:p>
       <w:pPr>
@@ -563,6 +612,13 @@
         </w:rPr>
         <w:t xml:space="preserve"> - Conference</w:t>
       </w:r>
+      <w:r>
+        <w:rPr>
+          <w:color w:val="5A646E"/>
+          <w:sz w:val="16"/>
+        </w:rPr>
+        <w:t xml:space="preserve"> - CVPR</w:t>
+      </w:r>
     </w:p>
     <w:p>
       <w:pPr>
@@ -614,6 +670,13 @@
           <w:sz w:val="17"/>
         </w:rPr>
         <w:t xml:space="preserve"> - Conference</w:t>
+      </w:r>
+      <w:r>
+        <w:rPr>
+          <w:color w:val="5A646E"/>
+          <w:sz w:val="16"/>
+        </w:rPr>
+        <w:t xml:space="preserve"> - MICCAI</w:t>
       </w:r>
       <w:r>
         <w:rPr>
@@ -676,6 +739,13 @@
       </w:r>
       <w:r>
         <w:rPr>
+          <w:color w:val="5A646E"/>
+          <w:sz w:val="16"/>
+        </w:rPr>
+        <w:t xml:space="preserve"> - ICCV</w:t>
+      </w:r>
+      <w:r>
+        <w:rPr>
           <w:color w:val="285078"/>
           <w:sz w:val="16"/>
         </w:rPr>
@@ -732,6 +802,13 @@
           <w:sz w:val="17"/>
         </w:rPr>
         <w:t xml:space="preserve"> - Conference</w:t>
+      </w:r>
+      <w:r>
+        <w:rPr>
+          <w:color w:val="5A646E"/>
+          <w:sz w:val="16"/>
+        </w:rPr>
+        <w:t xml:space="preserve"> - ICCV</w:t>
       </w:r>
       <w:r>
         <w:rPr>
@@ -794,6 +871,13 @@
       </w:r>
       <w:r>
         <w:rPr>
+          <w:color w:val="5A646E"/>
+          <w:sz w:val="16"/>
+        </w:rPr>
+        <w:t xml:space="preserve"> - CLiC-it</w:t>
+      </w:r>
+      <w:r>
+        <w:rPr>
           <w:color w:val="285078"/>
           <w:sz w:val="16"/>
         </w:rPr>
@@ -850,6 +934,13 @@
           <w:sz w:val="17"/>
         </w:rPr>
         <w:t xml:space="preserve"> - Conference</w:t>
+      </w:r>
+      <w:r>
+        <w:rPr>
+          <w:color w:val="5A646E"/>
+          <w:sz w:val="16"/>
+        </w:rPr>
+        <w:t xml:space="preserve"> - RTSI</w:t>
       </w:r>
       <w:r>
         <w:rPr>
@@ -939,6 +1030,13 @@
       </w:r>
       <w:r>
         <w:rPr>
+          <w:color w:val="5A646E"/>
+          <w:sz w:val="16"/>
+        </w:rPr>
+        <w:t xml:space="preserve"> - CBMS</w:t>
+      </w:r>
+      <w:r>
+        <w:rPr>
           <w:color w:val="285078"/>
           <w:sz w:val="16"/>
         </w:rPr>
@@ -995,6 +1093,13 @@
           <w:sz w:val="17"/>
         </w:rPr>
         <w:t xml:space="preserve"> - Conference</w:t>
+      </w:r>
+      <w:r>
+        <w:rPr>
+          <w:color w:val="5A646E"/>
+          <w:sz w:val="16"/>
+        </w:rPr>
+        <w:t xml:space="preserve"> - EMBC</w:t>
       </w:r>
       <w:r>
         <w:rPr>
@@ -1057,6 +1162,13 @@
       </w:r>
       <w:r>
         <w:rPr>
+          <w:color w:val="5A646E"/>
+          <w:sz w:val="16"/>
+        </w:rPr>
+        <w:t xml:space="preserve"> - BIBM</w:t>
+      </w:r>
+      <w:r>
+        <w:rPr>
           <w:color w:val="285078"/>
           <w:sz w:val="16"/>
         </w:rPr>
@@ -1113,6 +1225,13 @@
           <w:sz w:val="17"/>
         </w:rPr>
         <w:t xml:space="preserve"> - Conference</w:t>
+      </w:r>
+      <w:r>
+        <w:rPr>
+          <w:color w:val="5A646E"/>
+          <w:sz w:val="16"/>
+        </w:rPr>
+        <w:t xml:space="preserve"> - ICASSP</w:t>
       </w:r>
       <w:r>
         <w:rPr>
@@ -1202,6 +1321,13 @@
       </w:r>
       <w:r>
         <w:rPr>
+          <w:color w:val="5A646E"/>
+          <w:sz w:val="16"/>
+        </w:rPr>
+        <w:t xml:space="preserve"> - ISBI</w:t>
+      </w:r>
+      <w:r>
+        <w:rPr>
           <w:color w:val="285078"/>
           <w:sz w:val="16"/>
         </w:rPr>
@@ -1258,6 +1384,13 @@
           <w:sz w:val="17"/>
         </w:rPr>
         <w:t xml:space="preserve"> - Conference</w:t>
+      </w:r>
+      <w:r>
+        <w:rPr>
+          <w:color w:val="5A646E"/>
+          <w:sz w:val="16"/>
+        </w:rPr>
+        <w:t xml:space="preserve"> - ICCV</w:t>
       </w:r>
       <w:r>
         <w:rPr>
@@ -1320,6 +1453,13 @@
       </w:r>
       <w:r>
         <w:rPr>
+          <w:color w:val="5A646E"/>
+          <w:sz w:val="16"/>
+        </w:rPr>
+        <w:t xml:space="preserve"> - MCHM</w:t>
+      </w:r>
+      <w:r>
+        <w:rPr>
           <w:color w:val="285078"/>
           <w:sz w:val="16"/>
         </w:rPr>
@@ -1377,6 +1517,13 @@
         </w:rPr>
         <w:t xml:space="preserve"> - Workshop</w:t>
       </w:r>
+      <w:r>
+        <w:rPr>
+          <w:color w:val="5A646E"/>
+          <w:sz w:val="16"/>
+        </w:rPr>
+        <w:t xml:space="preserve"> - PILM</w:t>
+      </w:r>
     </w:p>
     <w:p>
       <w:pPr>
@@ -1431,6 +1578,13 @@
       </w:r>
       <w:r>
         <w:rPr>
+          <w:color w:val="5A646E"/>
+          <w:sz w:val="16"/>
+        </w:rPr>
+        <w:t xml:space="preserve"> - CIETES Companion</w:t>
+      </w:r>
+      <w:r>
+        <w:rPr>
           <w:color w:val="285078"/>
           <w:sz w:val="16"/>
         </w:rPr>
@@ -1462,6 +1616,72 @@
           <w:sz w:val="17"/>
         </w:rPr>
         <w:t>Intelligent systems for volcanology, industrial inspection, predictive reliability and traceability.</w:t>
+      </w:r>
+    </w:p>
+    <w:p>
+      <w:pPr>
+        <w:spacing w:after="20" w:line="240" w:lineRule="auto"/>
+        <w:ind w:left="173" w:hanging="173"/>
+      </w:pPr>
+      <w:r>
+        <w:rPr>
+          <w:b/>
+          <w:color w:val="C98C43"/>
+        </w:rPr>
+        <w:t xml:space="preserve">2026 - </w:t>
+      </w:r>
+      <w:r>
+        <w:rPr>
+          <w:b/>
+          <w:color w:val="0B1F33"/>
+        </w:rPr>
+        <w:t>When a model is not Enough: A Complementary AI Pipeline for Ultra-Safe PCBA Defect Detection</w:t>
+      </w:r>
+    </w:p>
+    <w:p>
+      <w:pPr>
+        <w:spacing w:after="20" w:line="240" w:lineRule="auto"/>
+        <w:ind w:left="173"/>
+      </w:pPr>
+      <w:r>
+        <w:rPr>
+          <w:sz w:val="17"/>
+        </w:rPr>
+        <w:t>Alberto Faro, Francesco Cancelliere, Robin Faro, Raffaele Mineo</w:t>
+      </w:r>
+    </w:p>
+    <w:p>
+      <w:pPr>
+        <w:spacing w:after="100" w:line="240" w:lineRule="auto"/>
+        <w:ind w:left="173"/>
+      </w:pPr>
+      <w:r>
+        <w:rPr>
+          <w:i/>
+          <w:sz w:val="17"/>
+        </w:rPr>
+        <w:t>The Autonomous Edge - Intelligence Embedded in Industrial Applications</w:t>
+      </w:r>
+      <w:r>
+        <w:rPr>
+          <w:color w:val="5A646E"/>
+          <w:sz w:val="17"/>
+        </w:rPr>
+        <w:t xml:space="preserve"> - Book Chapter</w:t>
+      </w:r>
+      <w:r>
+        <w:rPr>
+          <w:color w:val="5A646E"/>
+          <w:sz w:val="16"/>
+        </w:rPr>
+        <w:t xml:space="preserve"> - EEAI 2025</w:t>
+      </w:r>
+      <w:r>
+        <w:rPr>
+          <w:color w:val="285078"/>
+          <w:sz w:val="16"/>
+        </w:rPr>
+        <w:t xml:space="preserve"> - https://www.riverpublishers.com/research_details.php?book_id=1549</w:t>
       </w:r>
     </w:p>
     <w:p>
@@ -1514,6 +1734,13 @@
           <w:sz w:val="17"/>
         </w:rPr>
         <w:t xml:space="preserve"> - Conference</w:t>
+      </w:r>
+      <w:r>
+        <w:rPr>
+          <w:color w:val="5A646E"/>
+          <w:sz w:val="16"/>
+        </w:rPr>
+        <w:t xml:space="preserve"> - ICCV</w:t>
       </w:r>
       <w:r>
         <w:rPr>
@@ -1576,6 +1803,13 @@
       </w:r>
       <w:r>
         <w:rPr>
+          <w:color w:val="5A646E"/>
+          <w:sz w:val="16"/>
+        </w:rPr>
+        <w:t xml:space="preserve"> - ICCNS</w:t>
+      </w:r>
+      <w:r>
+        <w:rPr>
           <w:color w:val="285078"/>
           <w:sz w:val="16"/>
         </w:rPr>
@@ -1635,6 +1869,13 @@
       </w:r>
       <w:r>
         <w:rPr>
+          <w:color w:val="5A646E"/>
+          <w:sz w:val="16"/>
+        </w:rPr>
+        <w:t xml:space="preserve"> - EUROVOLC</w:t>
+      </w:r>
+      <w:r>
+        <w:rPr>
           <w:color w:val="285078"/>
           <w:sz w:val="16"/>
         </w:rPr>
@@ -1691,6 +1932,13 @@
           <w:sz w:val="17"/>
         </w:rPr>
         <w:t xml:space="preserve"> - Software</w:t>
+      </w:r>
+      <w:r>
+        <w:rPr>
+          <w:color w:val="5A646E"/>
+          <w:sz w:val="16"/>
+        </w:rPr>
+        <w:t xml:space="preserve"> - Zenodo</w:t>
       </w:r>
       <w:r>
         <w:rPr>
@@ -1778,6 +2026,13 @@
         </w:rPr>
         <w:t xml:space="preserve"> - Conference</w:t>
       </w:r>
+      <w:r>
+        <w:rPr>
+          <w:color w:val="5A646E"/>
+          <w:sz w:val="16"/>
+        </w:rPr>
+        <w:t xml:space="preserve"> - MICCAI</w:t>
+      </w:r>
     </w:p>
     <w:p>
       <w:pPr>
@@ -1829,6 +2084,13 @@
           <w:sz w:val="17"/>
         </w:rPr>
         <w:t xml:space="preserve"> - Edited Proceedings</w:t>
+      </w:r>
+      <w:r>
+        <w:rPr>
+          <w:color w:val="5A646E"/>
+          <w:sz w:val="16"/>
+        </w:rPr>
+        <w:t xml:space="preserve"> - ACM MM</w:t>
       </w:r>
       <w:r>
         <w:rPr>

</xml_diff>

<commit_message>
Synchronize verified publication list
</commit_message>
<xml_diff>
--- a/profile_private/Mineo_Raffaele_PublicationsList.docx
+++ b/profile_private/Mineo_Raffaele_PublicationsList.docx
@@ -81,7 +81,7 @@
     </w:p>
     <w:p>
       <w:pPr>
-        <w:spacing w:after="20" w:line="240" w:lineRule="auto"/>
+        <w:spacing w:after="20"/>
         <w:ind w:left="173" w:hanging="173"/>
       </w:pPr>
       <w:r>
@@ -101,7 +101,7 @@
     </w:p>
     <w:p>
       <w:pPr>
-        <w:spacing w:after="20" w:line="240" w:lineRule="auto"/>
+        <w:spacing w:after="20"/>
         <w:ind w:left="173"/>
       </w:pPr>
       <w:r>
@@ -113,7 +113,7 @@
     </w:p>
     <w:p>
       <w:pPr>
-        <w:spacing w:after="100" w:line="240" w:lineRule="auto"/>
+        <w:spacing w:after="100"/>
         <w:ind w:left="173"/>
       </w:pPr>
       <w:r>
@@ -147,7 +147,7 @@
     </w:p>
     <w:p>
       <w:pPr>
-        <w:spacing w:after="20" w:line="240" w:lineRule="auto"/>
+        <w:spacing w:after="20"/>
         <w:ind w:left="173" w:hanging="173"/>
       </w:pPr>
       <w:r>
@@ -167,7 +167,7 @@
     </w:p>
     <w:p>
       <w:pPr>
-        <w:spacing w:after="20" w:line="240" w:lineRule="auto"/>
+        <w:spacing w:after="20"/>
         <w:ind w:left="173"/>
       </w:pPr>
       <w:r>
@@ -179,7 +179,7 @@
     </w:p>
     <w:p>
       <w:pPr>
-        <w:spacing w:after="100" w:line="240" w:lineRule="auto"/>
+        <w:spacing w:after="100"/>
         <w:ind w:left="173"/>
       </w:pPr>
       <w:r>
@@ -213,7 +213,7 @@
     </w:p>
     <w:p>
       <w:pPr>
-        <w:spacing w:after="20" w:line="240" w:lineRule="auto"/>
+        <w:spacing w:after="20"/>
         <w:ind w:left="173" w:hanging="173"/>
       </w:pPr>
       <w:r>
@@ -233,7 +233,7 @@
     </w:p>
     <w:p>
       <w:pPr>
-        <w:spacing w:after="20" w:line="240" w:lineRule="auto"/>
+        <w:spacing w:after="20"/>
         <w:ind w:left="173"/>
       </w:pPr>
       <w:r>
@@ -245,7 +245,7 @@
     </w:p>
     <w:p>
       <w:pPr>
-        <w:spacing w:after="100" w:line="240" w:lineRule="auto"/>
+        <w:spacing w:after="100"/>
         <w:ind w:left="173"/>
       </w:pPr>
       <w:r>
@@ -279,7 +279,7 @@
     </w:p>
     <w:p>
       <w:pPr>
-        <w:spacing w:after="20" w:line="240" w:lineRule="auto"/>
+        <w:spacing w:after="20"/>
         <w:ind w:left="173" w:hanging="173"/>
       </w:pPr>
       <w:r>
@@ -299,7 +299,7 @@
     </w:p>
     <w:p>
       <w:pPr>
-        <w:spacing w:after="20" w:line="240" w:lineRule="auto"/>
+        <w:spacing w:after="20"/>
         <w:ind w:left="173"/>
       </w:pPr>
       <w:r>
@@ -311,7 +311,7 @@
     </w:p>
     <w:p>
       <w:pPr>
-        <w:spacing w:after="100" w:line="240" w:lineRule="auto"/>
+        <w:spacing w:after="100"/>
         <w:ind w:left="173"/>
       </w:pPr>
       <w:r>
@@ -345,7 +345,7 @@
     </w:p>
     <w:p>
       <w:pPr>
-        <w:spacing w:after="20" w:line="240" w:lineRule="auto"/>
+        <w:spacing w:after="20"/>
         <w:ind w:left="173" w:hanging="173"/>
       </w:pPr>
       <w:r>
@@ -365,7 +365,7 @@
     </w:p>
     <w:p>
       <w:pPr>
-        <w:spacing w:after="20" w:line="240" w:lineRule="auto"/>
+        <w:spacing w:after="20"/>
         <w:ind w:left="173"/>
       </w:pPr>
       <w:r>
@@ -377,7 +377,7 @@
     </w:p>
     <w:p>
       <w:pPr>
-        <w:spacing w:after="100" w:line="240" w:lineRule="auto"/>
+        <w:spacing w:after="100"/>
         <w:ind w:left="173"/>
       </w:pPr>
       <w:r>
@@ -411,7 +411,7 @@
     </w:p>
     <w:p>
       <w:pPr>
-        <w:spacing w:after="20" w:line="240" w:lineRule="auto"/>
+        <w:spacing w:after="20"/>
         <w:ind w:left="173" w:hanging="173"/>
       </w:pPr>
       <w:r>
@@ -431,7 +431,7 @@
     </w:p>
     <w:p>
       <w:pPr>
-        <w:spacing w:after="20" w:line="240" w:lineRule="auto"/>
+        <w:spacing w:after="20"/>
         <w:ind w:left="173"/>
       </w:pPr>
       <w:r>
@@ -443,7 +443,7 @@
     </w:p>
     <w:p>
       <w:pPr>
-        <w:spacing w:after="100" w:line="240" w:lineRule="auto"/>
+        <w:spacing w:after="100"/>
         <w:ind w:left="173"/>
       </w:pPr>
       <w:r>
@@ -504,7 +504,7 @@
     </w:p>
     <w:p>
       <w:pPr>
-        <w:spacing w:after="20" w:line="240" w:lineRule="auto"/>
+        <w:spacing w:after="20"/>
         <w:ind w:left="173" w:hanging="173"/>
       </w:pPr>
       <w:r>
@@ -524,7 +524,7 @@
     </w:p>
     <w:p>
       <w:pPr>
-        <w:spacing w:after="20" w:line="240" w:lineRule="auto"/>
+        <w:spacing w:after="20"/>
         <w:ind w:left="173"/>
       </w:pPr>
       <w:r>
@@ -536,7 +536,7 @@
     </w:p>
     <w:p>
       <w:pPr>
-        <w:spacing w:after="100" w:line="240" w:lineRule="auto"/>
+        <w:spacing w:after="100"/>
         <w:ind w:left="173"/>
       </w:pPr>
       <w:r>
@@ -563,7 +563,7 @@
     </w:p>
     <w:p>
       <w:pPr>
-        <w:spacing w:after="20" w:line="240" w:lineRule="auto"/>
+        <w:spacing w:after="20"/>
         <w:ind w:left="173" w:hanging="173"/>
       </w:pPr>
       <w:r>
@@ -583,7 +583,7 @@
     </w:p>
     <w:p>
       <w:pPr>
-        <w:spacing w:after="20" w:line="240" w:lineRule="auto"/>
+        <w:spacing w:after="20"/>
         <w:ind w:left="173"/>
       </w:pPr>
       <w:r>
@@ -595,7 +595,7 @@
     </w:p>
     <w:p>
       <w:pPr>
-        <w:spacing w:after="100" w:line="240" w:lineRule="auto"/>
+        <w:spacing w:after="100"/>
         <w:ind w:left="173"/>
       </w:pPr>
       <w:r>
@@ -622,7 +622,7 @@
     </w:p>
     <w:p>
       <w:pPr>
-        <w:spacing w:after="20" w:line="240" w:lineRule="auto"/>
+        <w:spacing w:after="20"/>
         <w:ind w:left="173" w:hanging="173"/>
       </w:pPr>
       <w:r>
@@ -642,7 +642,7 @@
     </w:p>
     <w:p>
       <w:pPr>
-        <w:spacing w:after="20" w:line="240" w:lineRule="auto"/>
+        <w:spacing w:after="20"/>
         <w:ind w:left="173"/>
       </w:pPr>
       <w:r>
@@ -654,7 +654,7 @@
     </w:p>
     <w:p>
       <w:pPr>
-        <w:spacing w:after="100" w:line="240" w:lineRule="auto"/>
+        <w:spacing w:after="100"/>
         <w:ind w:left="173"/>
       </w:pPr>
       <w:r>
@@ -688,7 +688,7 @@
     </w:p>
     <w:p>
       <w:pPr>
-        <w:spacing w:after="20" w:line="240" w:lineRule="auto"/>
+        <w:spacing w:after="20"/>
         <w:ind w:left="173" w:hanging="173"/>
       </w:pPr>
       <w:r>
@@ -708,7 +708,7 @@
     </w:p>
     <w:p>
       <w:pPr>
-        <w:spacing w:after="20" w:line="240" w:lineRule="auto"/>
+        <w:spacing w:after="20"/>
         <w:ind w:left="173"/>
       </w:pPr>
       <w:r>
@@ -720,7 +720,7 @@
     </w:p>
     <w:p>
       <w:pPr>
-        <w:spacing w:after="100" w:line="240" w:lineRule="auto"/>
+        <w:spacing w:after="100"/>
         <w:ind w:left="173"/>
       </w:pPr>
       <w:r>
@@ -754,7 +754,7 @@
     </w:p>
     <w:p>
       <w:pPr>
-        <w:spacing w:after="20" w:line="240" w:lineRule="auto"/>
+        <w:spacing w:after="20"/>
         <w:ind w:left="173" w:hanging="173"/>
       </w:pPr>
       <w:r>
@@ -774,7 +774,7 @@
     </w:p>
     <w:p>
       <w:pPr>
-        <w:spacing w:after="20" w:line="240" w:lineRule="auto"/>
+        <w:spacing w:after="20"/>
         <w:ind w:left="173"/>
       </w:pPr>
       <w:r>
@@ -786,7 +786,7 @@
     </w:p>
     <w:p>
       <w:pPr>
-        <w:spacing w:after="100" w:line="240" w:lineRule="auto"/>
+        <w:spacing w:after="100"/>
         <w:ind w:left="173"/>
       </w:pPr>
       <w:r>
@@ -820,7 +820,7 @@
     </w:p>
     <w:p>
       <w:pPr>
-        <w:spacing w:after="20" w:line="240" w:lineRule="auto"/>
+        <w:spacing w:after="20"/>
         <w:ind w:left="173" w:hanging="173"/>
       </w:pPr>
       <w:r>
@@ -840,7 +840,7 @@
     </w:p>
     <w:p>
       <w:pPr>
-        <w:spacing w:after="20" w:line="240" w:lineRule="auto"/>
+        <w:spacing w:after="20"/>
         <w:ind w:left="173"/>
       </w:pPr>
       <w:r>
@@ -852,7 +852,7 @@
     </w:p>
     <w:p>
       <w:pPr>
-        <w:spacing w:after="100" w:line="240" w:lineRule="auto"/>
+        <w:spacing w:after="100"/>
         <w:ind w:left="173"/>
       </w:pPr>
       <w:r>
@@ -886,7 +886,7 @@
     </w:p>
     <w:p>
       <w:pPr>
-        <w:spacing w:after="20" w:line="240" w:lineRule="auto"/>
+        <w:spacing w:after="20"/>
         <w:ind w:left="173" w:hanging="173"/>
       </w:pPr>
       <w:r>
@@ -906,7 +906,7 @@
     </w:p>
     <w:p>
       <w:pPr>
-        <w:spacing w:after="20" w:line="240" w:lineRule="auto"/>
+        <w:spacing w:after="20"/>
         <w:ind w:left="173"/>
       </w:pPr>
       <w:r>
@@ -918,7 +918,7 @@
     </w:p>
     <w:p>
       <w:pPr>
-        <w:spacing w:after="100" w:line="240" w:lineRule="auto"/>
+        <w:spacing w:after="100"/>
         <w:ind w:left="173"/>
       </w:pPr>
       <w:r>
@@ -979,7 +979,7 @@
     </w:p>
     <w:p>
       <w:pPr>
-        <w:spacing w:after="20" w:line="240" w:lineRule="auto"/>
+        <w:spacing w:after="20"/>
         <w:ind w:left="173" w:hanging="173"/>
       </w:pPr>
       <w:r>
@@ -999,7 +999,7 @@
     </w:p>
     <w:p>
       <w:pPr>
-        <w:spacing w:after="20" w:line="240" w:lineRule="auto"/>
+        <w:spacing w:after="20"/>
         <w:ind w:left="173"/>
       </w:pPr>
       <w:r>
@@ -1011,7 +1011,7 @@
     </w:p>
     <w:p>
       <w:pPr>
-        <w:spacing w:after="100" w:line="240" w:lineRule="auto"/>
+        <w:spacing w:after="100"/>
         <w:ind w:left="173"/>
       </w:pPr>
       <w:r>
@@ -1045,7 +1045,7 @@
     </w:p>
     <w:p>
       <w:pPr>
-        <w:spacing w:after="20" w:line="240" w:lineRule="auto"/>
+        <w:spacing w:after="20"/>
         <w:ind w:left="173" w:hanging="173"/>
       </w:pPr>
       <w:r>
@@ -1065,7 +1065,7 @@
     </w:p>
     <w:p>
       <w:pPr>
-        <w:spacing w:after="20" w:line="240" w:lineRule="auto"/>
+        <w:spacing w:after="20"/>
         <w:ind w:left="173"/>
       </w:pPr>
       <w:r>
@@ -1077,7 +1077,7 @@
     </w:p>
     <w:p>
       <w:pPr>
-        <w:spacing w:after="100" w:line="240" w:lineRule="auto"/>
+        <w:spacing w:after="100"/>
         <w:ind w:left="173"/>
       </w:pPr>
       <w:r>
@@ -1111,7 +1111,7 @@
     </w:p>
     <w:p>
       <w:pPr>
-        <w:spacing w:after="20" w:line="240" w:lineRule="auto"/>
+        <w:spacing w:after="20"/>
         <w:ind w:left="173" w:hanging="173"/>
       </w:pPr>
       <w:r>
@@ -1131,7 +1131,7 @@
     </w:p>
     <w:p>
       <w:pPr>
-        <w:spacing w:after="20" w:line="240" w:lineRule="auto"/>
+        <w:spacing w:after="20"/>
         <w:ind w:left="173"/>
       </w:pPr>
       <w:r>
@@ -1143,7 +1143,7 @@
     </w:p>
     <w:p>
       <w:pPr>
-        <w:spacing w:after="100" w:line="240" w:lineRule="auto"/>
+        <w:spacing w:after="100"/>
         <w:ind w:left="173"/>
       </w:pPr>
       <w:r>
@@ -1177,7 +1177,7 @@
     </w:p>
     <w:p>
       <w:pPr>
-        <w:spacing w:after="20" w:line="240" w:lineRule="auto"/>
+        <w:spacing w:after="20"/>
         <w:ind w:left="173" w:hanging="173"/>
       </w:pPr>
       <w:r>
@@ -1197,7 +1197,7 @@
     </w:p>
     <w:p>
       <w:pPr>
-        <w:spacing w:after="20" w:line="240" w:lineRule="auto"/>
+        <w:spacing w:after="20"/>
         <w:ind w:left="173"/>
       </w:pPr>
       <w:r>
@@ -1209,7 +1209,7 @@
     </w:p>
     <w:p>
       <w:pPr>
-        <w:spacing w:after="100" w:line="240" w:lineRule="auto"/>
+        <w:spacing w:after="100"/>
         <w:ind w:left="173"/>
       </w:pPr>
       <w:r>
@@ -1270,7 +1270,7 @@
     </w:p>
     <w:p>
       <w:pPr>
-        <w:spacing w:after="20" w:line="240" w:lineRule="auto"/>
+        <w:spacing w:after="20"/>
         <w:ind w:left="173" w:hanging="173"/>
       </w:pPr>
       <w:r>
@@ -1290,7 +1290,7 @@
     </w:p>
     <w:p>
       <w:pPr>
-        <w:spacing w:after="20" w:line="240" w:lineRule="auto"/>
+        <w:spacing w:after="20"/>
         <w:ind w:left="173"/>
       </w:pPr>
       <w:r>
@@ -1302,7 +1302,7 @@
     </w:p>
     <w:p>
       <w:pPr>
-        <w:spacing w:after="100" w:line="240" w:lineRule="auto"/>
+        <w:spacing w:after="100"/>
         <w:ind w:left="173"/>
       </w:pPr>
       <w:r>
@@ -1336,7 +1336,7 @@
     </w:p>
     <w:p>
       <w:pPr>
-        <w:spacing w:after="20" w:line="240" w:lineRule="auto"/>
+        <w:spacing w:after="20"/>
         <w:ind w:left="173" w:hanging="173"/>
       </w:pPr>
       <w:r>
@@ -1356,7 +1356,7 @@
     </w:p>
     <w:p>
       <w:pPr>
-        <w:spacing w:after="20" w:line="240" w:lineRule="auto"/>
+        <w:spacing w:after="20"/>
         <w:ind w:left="173"/>
       </w:pPr>
       <w:r>
@@ -1368,7 +1368,7 @@
     </w:p>
     <w:p>
       <w:pPr>
-        <w:spacing w:after="100" w:line="240" w:lineRule="auto"/>
+        <w:spacing w:after="100"/>
         <w:ind w:left="173"/>
       </w:pPr>
       <w:r>
@@ -1402,7 +1402,7 @@
     </w:p>
     <w:p>
       <w:pPr>
-        <w:spacing w:after="20" w:line="240" w:lineRule="auto"/>
+        <w:spacing w:after="20"/>
         <w:ind w:left="173" w:hanging="173"/>
       </w:pPr>
       <w:r>
@@ -1422,7 +1422,7 @@
     </w:p>
     <w:p>
       <w:pPr>
-        <w:spacing w:after="20" w:line="240" w:lineRule="auto"/>
+        <w:spacing w:after="20"/>
         <w:ind w:left="173"/>
       </w:pPr>
       <w:r>
@@ -1434,7 +1434,7 @@
     </w:p>
     <w:p>
       <w:pPr>
-        <w:spacing w:after="100" w:line="240" w:lineRule="auto"/>
+        <w:spacing w:after="100"/>
         <w:ind w:left="173"/>
       </w:pPr>
       <w:r>
@@ -1468,66 +1468,7 @@
     </w:p>
     <w:p>
       <w:pPr>
-        <w:spacing w:after="20" w:line="240" w:lineRule="auto"/>
-        <w:ind w:left="173" w:hanging="173"/>
-      </w:pPr>
-      <w:r>
-        <w:rPr>
-          <w:b/>
-          <w:color w:val="C98C43"/>
-        </w:rPr>
-        <w:t xml:space="preserve">2025 - </w:t>
-      </w:r>
-      <w:r>
-        <w:rPr>
-          <w:b/>
-          <w:color w:val="0B1F33"/>
-        </w:rPr>
-        <w:t>Memory-Augmented Prompt Tuning for Self-Supervised Continual Learning in Medical Imaging</w:t>
-      </w:r>
-    </w:p>
-    <w:p>
-      <w:pPr>
-        <w:spacing w:after="20" w:line="240" w:lineRule="auto"/>
-        <w:ind w:left="173"/>
-      </w:pPr>
-      <w:r>
-        <w:rPr>
-          <w:sz w:val="17"/>
-        </w:rPr>
-        <w:t>-</w:t>
-      </w:r>
-    </w:p>
-    <w:p>
-      <w:pPr>
-        <w:spacing w:after="100" w:line="240" w:lineRule="auto"/>
-        <w:ind w:left="173"/>
-      </w:pPr>
-      <w:r>
-        <w:rPr>
-          <w:i/>
-          <w:sz w:val="17"/>
-        </w:rPr>
-        <w:t>International Workshop on Personalized Incremental Learning in Medicine (PILM)</w:t>
-      </w:r>
-      <w:r>
-        <w:rPr>
-          <w:color w:val="5A646E"/>
-          <w:sz w:val="17"/>
-        </w:rPr>
-        <w:t xml:space="preserve"> - Workshop</w:t>
-      </w:r>
-      <w:r>
-        <w:rPr>
-          <w:color w:val="5A646E"/>
-          <w:sz w:val="16"/>
-        </w:rPr>
-        <w:t xml:space="preserve"> - PILM</w:t>
-      </w:r>
-    </w:p>
-    <w:p>
-      <w:pPr>
-        <w:spacing w:after="20" w:line="240" w:lineRule="auto"/>
+        <w:spacing w:after="20"/>
         <w:ind w:left="173" w:hanging="173"/>
       </w:pPr>
       <w:r>
@@ -1547,7 +1488,7 @@
     </w:p>
     <w:p>
       <w:pPr>
-        <w:spacing w:after="20" w:line="240" w:lineRule="auto"/>
+        <w:spacing w:after="20"/>
         <w:ind w:left="173"/>
       </w:pPr>
       <w:r>
@@ -1559,7 +1500,7 @@
     </w:p>
     <w:p>
       <w:pPr>
-        <w:spacing w:after="100" w:line="240" w:lineRule="auto"/>
+        <w:spacing w:after="100"/>
         <w:ind w:left="173"/>
       </w:pPr>
       <w:r>
@@ -1620,7 +1561,7 @@
     </w:p>
     <w:p>
       <w:pPr>
-        <w:spacing w:after="20" w:line="240" w:lineRule="auto"/>
+        <w:spacing w:after="20"/>
         <w:ind w:left="173" w:hanging="173"/>
       </w:pPr>
       <w:r>
@@ -1640,7 +1581,7 @@
     </w:p>
     <w:p>
       <w:pPr>
-        <w:spacing w:after="20" w:line="240" w:lineRule="auto"/>
+        <w:spacing w:after="20"/>
         <w:ind w:left="173"/>
       </w:pPr>
       <w:r>
@@ -1652,7 +1593,7 @@
     </w:p>
     <w:p>
       <w:pPr>
-        <w:spacing w:after="100" w:line="240" w:lineRule="auto"/>
+        <w:spacing w:after="100"/>
         <w:ind w:left="173"/>
       </w:pPr>
       <w:r>
@@ -1686,7 +1627,7 @@
     </w:p>
     <w:p>
       <w:pPr>
-        <w:spacing w:after="20" w:line="240" w:lineRule="auto"/>
+        <w:spacing w:after="20"/>
         <w:ind w:left="173" w:hanging="173"/>
       </w:pPr>
       <w:r>
@@ -1706,7 +1647,7 @@
     </w:p>
     <w:p>
       <w:pPr>
-        <w:spacing w:after="20" w:line="240" w:lineRule="auto"/>
+        <w:spacing w:after="20"/>
         <w:ind w:left="173"/>
       </w:pPr>
       <w:r>
@@ -1718,7 +1659,7 @@
     </w:p>
     <w:p>
       <w:pPr>
-        <w:spacing w:after="100" w:line="240" w:lineRule="auto"/>
+        <w:spacing w:after="100"/>
         <w:ind w:left="173"/>
       </w:pPr>
       <w:r>
@@ -1752,7 +1693,7 @@
     </w:p>
     <w:p>
       <w:pPr>
-        <w:spacing w:after="20" w:line="240" w:lineRule="auto"/>
+        <w:spacing w:after="20"/>
         <w:ind w:left="173" w:hanging="173"/>
       </w:pPr>
       <w:r>
@@ -1772,7 +1713,7 @@
     </w:p>
     <w:p>
       <w:pPr>
-        <w:spacing w:after="20" w:line="240" w:lineRule="auto"/>
+        <w:spacing w:after="20"/>
         <w:ind w:left="173"/>
       </w:pPr>
       <w:r>
@@ -1784,7 +1725,7 @@
     </w:p>
     <w:p>
       <w:pPr>
-        <w:spacing w:after="100" w:line="240" w:lineRule="auto"/>
+        <w:spacing w:after="100"/>
         <w:ind w:left="173"/>
       </w:pPr>
       <w:r>
@@ -1818,7 +1759,7 @@
     </w:p>
     <w:p>
       <w:pPr>
-        <w:spacing w:after="20" w:line="240" w:lineRule="auto"/>
+        <w:spacing w:after="20"/>
         <w:ind w:left="173" w:hanging="173"/>
       </w:pPr>
       <w:r>
@@ -1838,7 +1779,7 @@
     </w:p>
     <w:p>
       <w:pPr>
-        <w:spacing w:after="20" w:line="240" w:lineRule="auto"/>
+        <w:spacing w:after="20"/>
         <w:ind w:left="173"/>
       </w:pPr>
       <w:r>
@@ -1850,7 +1791,7 @@
     </w:p>
     <w:p>
       <w:pPr>
-        <w:spacing w:after="100" w:line="240" w:lineRule="auto"/>
+        <w:spacing w:after="100"/>
         <w:ind w:left="173"/>
       </w:pPr>
       <w:r>
@@ -1884,7 +1825,7 @@
     </w:p>
     <w:p>
       <w:pPr>
-        <w:spacing w:after="20" w:line="240" w:lineRule="auto"/>
+        <w:spacing w:after="20"/>
         <w:ind w:left="173" w:hanging="173"/>
       </w:pPr>
       <w:r>
@@ -1904,7 +1845,7 @@
     </w:p>
     <w:p>
       <w:pPr>
-        <w:spacing w:after="20" w:line="240" w:lineRule="auto"/>
+        <w:spacing w:after="20"/>
         <w:ind w:left="173"/>
       </w:pPr>
       <w:r>
@@ -1916,7 +1857,7 @@
     </w:p>
     <w:p>
       <w:pPr>
-        <w:spacing w:after="100" w:line="240" w:lineRule="auto"/>
+        <w:spacing w:after="100"/>
         <w:ind w:left="173"/>
       </w:pPr>
       <w:r>
@@ -1977,7 +1918,7 @@
     </w:p>
     <w:p>
       <w:pPr>
-        <w:spacing w:after="20" w:line="240" w:lineRule="auto"/>
+        <w:spacing w:after="20"/>
         <w:ind w:left="173" w:hanging="173"/>
       </w:pPr>
       <w:r>
@@ -1997,7 +1938,7 @@
     </w:p>
     <w:p>
       <w:pPr>
-        <w:spacing w:after="20" w:line="240" w:lineRule="auto"/>
+        <w:spacing w:after="20"/>
         <w:ind w:left="173"/>
       </w:pPr>
       <w:r>
@@ -2009,7 +1950,7 @@
     </w:p>
     <w:p>
       <w:pPr>
-        <w:spacing w:after="100" w:line="240" w:lineRule="auto"/>
+        <w:spacing w:after="100"/>
         <w:ind w:left="173"/>
       </w:pPr>
       <w:r>
@@ -2036,7 +1977,7 @@
     </w:p>
     <w:p>
       <w:pPr>
-        <w:spacing w:after="20" w:line="240" w:lineRule="auto"/>
+        <w:spacing w:after="20"/>
         <w:ind w:left="173" w:hanging="173"/>
       </w:pPr>
       <w:r>
@@ -2056,7 +1997,7 @@
     </w:p>
     <w:p>
       <w:pPr>
-        <w:spacing w:after="20" w:line="240" w:lineRule="auto"/>
+        <w:spacing w:after="20"/>
         <w:ind w:left="173"/>
       </w:pPr>
       <w:r>
@@ -2068,7 +2009,7 @@
     </w:p>
     <w:p>
       <w:pPr>
-        <w:spacing w:after="100" w:line="240" w:lineRule="auto"/>
+        <w:spacing w:after="100"/>
         <w:ind w:left="173"/>
       </w:pPr>
       <w:r>

</xml_diff>

<commit_message>
Sync publication archive and remove MAPT
</commit_message>
<xml_diff>
--- a/profile_private/Mineo_Raffaele_PublicationsList.docx
+++ b/profile_private/Mineo_Raffaele_PublicationsList.docx
@@ -81,7 +81,7 @@
     </w:p>
     <w:p>
       <w:pPr>
-        <w:spacing w:after="20"/>
+        <w:spacing w:after="20" w:line="240" w:lineRule="auto"/>
         <w:ind w:left="173" w:hanging="173"/>
       </w:pPr>
       <w:r>
@@ -101,7 +101,7 @@
     </w:p>
     <w:p>
       <w:pPr>
-        <w:spacing w:after="20"/>
+        <w:spacing w:after="20" w:line="240" w:lineRule="auto"/>
         <w:ind w:left="173"/>
       </w:pPr>
       <w:r>
@@ -113,7 +113,7 @@
     </w:p>
     <w:p>
       <w:pPr>
-        <w:spacing w:after="100"/>
+        <w:spacing w:after="100" w:line="240" w:lineRule="auto"/>
         <w:ind w:left="173"/>
       </w:pPr>
       <w:r>
@@ -147,7 +147,7 @@
     </w:p>
     <w:p>
       <w:pPr>
-        <w:spacing w:after="20"/>
+        <w:spacing w:after="20" w:line="240" w:lineRule="auto"/>
         <w:ind w:left="173" w:hanging="173"/>
       </w:pPr>
       <w:r>
@@ -167,7 +167,7 @@
     </w:p>
     <w:p>
       <w:pPr>
-        <w:spacing w:after="20"/>
+        <w:spacing w:after="20" w:line="240" w:lineRule="auto"/>
         <w:ind w:left="173"/>
       </w:pPr>
       <w:r>
@@ -179,7 +179,7 @@
     </w:p>
     <w:p>
       <w:pPr>
-        <w:spacing w:after="100"/>
+        <w:spacing w:after="100" w:line="240" w:lineRule="auto"/>
         <w:ind w:left="173"/>
       </w:pPr>
       <w:r>
@@ -213,7 +213,7 @@
     </w:p>
     <w:p>
       <w:pPr>
-        <w:spacing w:after="20"/>
+        <w:spacing w:after="20" w:line="240" w:lineRule="auto"/>
         <w:ind w:left="173" w:hanging="173"/>
       </w:pPr>
       <w:r>
@@ -233,7 +233,7 @@
     </w:p>
     <w:p>
       <w:pPr>
-        <w:spacing w:after="20"/>
+        <w:spacing w:after="20" w:line="240" w:lineRule="auto"/>
         <w:ind w:left="173"/>
       </w:pPr>
       <w:r>
@@ -245,7 +245,7 @@
     </w:p>
     <w:p>
       <w:pPr>
-        <w:spacing w:after="100"/>
+        <w:spacing w:after="100" w:line="240" w:lineRule="auto"/>
         <w:ind w:left="173"/>
       </w:pPr>
       <w:r>
@@ -279,7 +279,7 @@
     </w:p>
     <w:p>
       <w:pPr>
-        <w:spacing w:after="20"/>
+        <w:spacing w:after="20" w:line="240" w:lineRule="auto"/>
         <w:ind w:left="173" w:hanging="173"/>
       </w:pPr>
       <w:r>
@@ -299,7 +299,7 @@
     </w:p>
     <w:p>
       <w:pPr>
-        <w:spacing w:after="20"/>
+        <w:spacing w:after="20" w:line="240" w:lineRule="auto"/>
         <w:ind w:left="173"/>
       </w:pPr>
       <w:r>
@@ -311,7 +311,7 @@
     </w:p>
     <w:p>
       <w:pPr>
-        <w:spacing w:after="100"/>
+        <w:spacing w:after="100" w:line="240" w:lineRule="auto"/>
         <w:ind w:left="173"/>
       </w:pPr>
       <w:r>
@@ -345,7 +345,7 @@
     </w:p>
     <w:p>
       <w:pPr>
-        <w:spacing w:after="20"/>
+        <w:spacing w:after="20" w:line="240" w:lineRule="auto"/>
         <w:ind w:left="173" w:hanging="173"/>
       </w:pPr>
       <w:r>
@@ -365,7 +365,7 @@
     </w:p>
     <w:p>
       <w:pPr>
-        <w:spacing w:after="20"/>
+        <w:spacing w:after="20" w:line="240" w:lineRule="auto"/>
         <w:ind w:left="173"/>
       </w:pPr>
       <w:r>
@@ -377,7 +377,7 @@
     </w:p>
     <w:p>
       <w:pPr>
-        <w:spacing w:after="100"/>
+        <w:spacing w:after="100" w:line="240" w:lineRule="auto"/>
         <w:ind w:left="173"/>
       </w:pPr>
       <w:r>
@@ -411,7 +411,7 @@
     </w:p>
     <w:p>
       <w:pPr>
-        <w:spacing w:after="20"/>
+        <w:spacing w:after="20" w:line="240" w:lineRule="auto"/>
         <w:ind w:left="173" w:hanging="173"/>
       </w:pPr>
       <w:r>
@@ -431,7 +431,7 @@
     </w:p>
     <w:p>
       <w:pPr>
-        <w:spacing w:after="20"/>
+        <w:spacing w:after="20" w:line="240" w:lineRule="auto"/>
         <w:ind w:left="173"/>
       </w:pPr>
       <w:r>
@@ -443,7 +443,7 @@
     </w:p>
     <w:p>
       <w:pPr>
-        <w:spacing w:after="100"/>
+        <w:spacing w:after="100" w:line="240" w:lineRule="auto"/>
         <w:ind w:left="173"/>
       </w:pPr>
       <w:r>
@@ -504,7 +504,7 @@
     </w:p>
     <w:p>
       <w:pPr>
-        <w:spacing w:after="20"/>
+        <w:spacing w:after="20" w:line="240" w:lineRule="auto"/>
         <w:ind w:left="173" w:hanging="173"/>
       </w:pPr>
       <w:r>
@@ -524,7 +524,7 @@
     </w:p>
     <w:p>
       <w:pPr>
-        <w:spacing w:after="20"/>
+        <w:spacing w:after="20" w:line="240" w:lineRule="auto"/>
         <w:ind w:left="173"/>
       </w:pPr>
       <w:r>
@@ -536,7 +536,7 @@
     </w:p>
     <w:p>
       <w:pPr>
-        <w:spacing w:after="100"/>
+        <w:spacing w:after="100" w:line="240" w:lineRule="auto"/>
         <w:ind w:left="173"/>
       </w:pPr>
       <w:r>
@@ -563,7 +563,7 @@
     </w:p>
     <w:p>
       <w:pPr>
-        <w:spacing w:after="20"/>
+        <w:spacing w:after="20" w:line="240" w:lineRule="auto"/>
         <w:ind w:left="173" w:hanging="173"/>
       </w:pPr>
       <w:r>
@@ -583,7 +583,7 @@
     </w:p>
     <w:p>
       <w:pPr>
-        <w:spacing w:after="20"/>
+        <w:spacing w:after="20" w:line="240" w:lineRule="auto"/>
         <w:ind w:left="173"/>
       </w:pPr>
       <w:r>
@@ -595,7 +595,7 @@
     </w:p>
     <w:p>
       <w:pPr>
-        <w:spacing w:after="100"/>
+        <w:spacing w:after="100" w:line="240" w:lineRule="auto"/>
         <w:ind w:left="173"/>
       </w:pPr>
       <w:r>
@@ -622,7 +622,7 @@
     </w:p>
     <w:p>
       <w:pPr>
-        <w:spacing w:after="20"/>
+        <w:spacing w:after="20" w:line="240" w:lineRule="auto"/>
         <w:ind w:left="173" w:hanging="173"/>
       </w:pPr>
       <w:r>
@@ -642,7 +642,7 @@
     </w:p>
     <w:p>
       <w:pPr>
-        <w:spacing w:after="20"/>
+        <w:spacing w:after="20" w:line="240" w:lineRule="auto"/>
         <w:ind w:left="173"/>
       </w:pPr>
       <w:r>
@@ -654,7 +654,7 @@
     </w:p>
     <w:p>
       <w:pPr>
-        <w:spacing w:after="100"/>
+        <w:spacing w:after="100" w:line="240" w:lineRule="auto"/>
         <w:ind w:left="173"/>
       </w:pPr>
       <w:r>
@@ -688,7 +688,7 @@
     </w:p>
     <w:p>
       <w:pPr>
-        <w:spacing w:after="20"/>
+        <w:spacing w:after="20" w:line="240" w:lineRule="auto"/>
         <w:ind w:left="173" w:hanging="173"/>
       </w:pPr>
       <w:r>
@@ -708,7 +708,7 @@
     </w:p>
     <w:p>
       <w:pPr>
-        <w:spacing w:after="20"/>
+        <w:spacing w:after="20" w:line="240" w:lineRule="auto"/>
         <w:ind w:left="173"/>
       </w:pPr>
       <w:r>
@@ -720,7 +720,7 @@
     </w:p>
     <w:p>
       <w:pPr>
-        <w:spacing w:after="100"/>
+        <w:spacing w:after="100" w:line="240" w:lineRule="auto"/>
         <w:ind w:left="173"/>
       </w:pPr>
       <w:r>
@@ -754,7 +754,7 @@
     </w:p>
     <w:p>
       <w:pPr>
-        <w:spacing w:after="20"/>
+        <w:spacing w:after="20" w:line="240" w:lineRule="auto"/>
         <w:ind w:left="173" w:hanging="173"/>
       </w:pPr>
       <w:r>
@@ -774,7 +774,7 @@
     </w:p>
     <w:p>
       <w:pPr>
-        <w:spacing w:after="20"/>
+        <w:spacing w:after="20" w:line="240" w:lineRule="auto"/>
         <w:ind w:left="173"/>
       </w:pPr>
       <w:r>
@@ -786,7 +786,7 @@
     </w:p>
     <w:p>
       <w:pPr>
-        <w:spacing w:after="100"/>
+        <w:spacing w:after="100" w:line="240" w:lineRule="auto"/>
         <w:ind w:left="173"/>
       </w:pPr>
       <w:r>
@@ -820,7 +820,7 @@
     </w:p>
     <w:p>
       <w:pPr>
-        <w:spacing w:after="20"/>
+        <w:spacing w:after="20" w:line="240" w:lineRule="auto"/>
         <w:ind w:left="173" w:hanging="173"/>
       </w:pPr>
       <w:r>
@@ -840,7 +840,7 @@
     </w:p>
     <w:p>
       <w:pPr>
-        <w:spacing w:after="20"/>
+        <w:spacing w:after="20" w:line="240" w:lineRule="auto"/>
         <w:ind w:left="173"/>
       </w:pPr>
       <w:r>
@@ -852,7 +852,7 @@
     </w:p>
     <w:p>
       <w:pPr>
-        <w:spacing w:after="100"/>
+        <w:spacing w:after="100" w:line="240" w:lineRule="auto"/>
         <w:ind w:left="173"/>
       </w:pPr>
       <w:r>
@@ -886,7 +886,7 @@
     </w:p>
     <w:p>
       <w:pPr>
-        <w:spacing w:after="20"/>
+        <w:spacing w:after="20" w:line="240" w:lineRule="auto"/>
         <w:ind w:left="173" w:hanging="173"/>
       </w:pPr>
       <w:r>
@@ -906,7 +906,7 @@
     </w:p>
     <w:p>
       <w:pPr>
-        <w:spacing w:after="20"/>
+        <w:spacing w:after="20" w:line="240" w:lineRule="auto"/>
         <w:ind w:left="173"/>
       </w:pPr>
       <w:r>
@@ -918,7 +918,7 @@
     </w:p>
     <w:p>
       <w:pPr>
-        <w:spacing w:after="100"/>
+        <w:spacing w:after="100" w:line="240" w:lineRule="auto"/>
         <w:ind w:left="173"/>
       </w:pPr>
       <w:r>
@@ -979,7 +979,7 @@
     </w:p>
     <w:p>
       <w:pPr>
-        <w:spacing w:after="20"/>
+        <w:spacing w:after="20" w:line="240" w:lineRule="auto"/>
         <w:ind w:left="173" w:hanging="173"/>
       </w:pPr>
       <w:r>
@@ -999,7 +999,7 @@
     </w:p>
     <w:p>
       <w:pPr>
-        <w:spacing w:after="20"/>
+        <w:spacing w:after="20" w:line="240" w:lineRule="auto"/>
         <w:ind w:left="173"/>
       </w:pPr>
       <w:r>
@@ -1011,7 +1011,7 @@
     </w:p>
     <w:p>
       <w:pPr>
-        <w:spacing w:after="100"/>
+        <w:spacing w:after="100" w:line="240" w:lineRule="auto"/>
         <w:ind w:left="173"/>
       </w:pPr>
       <w:r>
@@ -1045,7 +1045,7 @@
     </w:p>
     <w:p>
       <w:pPr>
-        <w:spacing w:after="20"/>
+        <w:spacing w:after="20" w:line="240" w:lineRule="auto"/>
         <w:ind w:left="173" w:hanging="173"/>
       </w:pPr>
       <w:r>
@@ -1065,7 +1065,7 @@
     </w:p>
     <w:p>
       <w:pPr>
-        <w:spacing w:after="20"/>
+        <w:spacing w:after="20" w:line="240" w:lineRule="auto"/>
         <w:ind w:left="173"/>
       </w:pPr>
       <w:r>
@@ -1077,7 +1077,7 @@
     </w:p>
     <w:p>
       <w:pPr>
-        <w:spacing w:after="100"/>
+        <w:spacing w:after="100" w:line="240" w:lineRule="auto"/>
         <w:ind w:left="173"/>
       </w:pPr>
       <w:r>
@@ -1111,7 +1111,7 @@
     </w:p>
     <w:p>
       <w:pPr>
-        <w:spacing w:after="20"/>
+        <w:spacing w:after="20" w:line="240" w:lineRule="auto"/>
         <w:ind w:left="173" w:hanging="173"/>
       </w:pPr>
       <w:r>
@@ -1131,7 +1131,7 @@
     </w:p>
     <w:p>
       <w:pPr>
-        <w:spacing w:after="20"/>
+        <w:spacing w:after="20" w:line="240" w:lineRule="auto"/>
         <w:ind w:left="173"/>
       </w:pPr>
       <w:r>
@@ -1143,7 +1143,7 @@
     </w:p>
     <w:p>
       <w:pPr>
-        <w:spacing w:after="100"/>
+        <w:spacing w:after="100" w:line="240" w:lineRule="auto"/>
         <w:ind w:left="173"/>
       </w:pPr>
       <w:r>
@@ -1177,7 +1177,7 @@
     </w:p>
     <w:p>
       <w:pPr>
-        <w:spacing w:after="20"/>
+        <w:spacing w:after="20" w:line="240" w:lineRule="auto"/>
         <w:ind w:left="173" w:hanging="173"/>
       </w:pPr>
       <w:r>
@@ -1197,7 +1197,7 @@
     </w:p>
     <w:p>
       <w:pPr>
-        <w:spacing w:after="20"/>
+        <w:spacing w:after="20" w:line="240" w:lineRule="auto"/>
         <w:ind w:left="173"/>
       </w:pPr>
       <w:r>
@@ -1209,7 +1209,7 @@
     </w:p>
     <w:p>
       <w:pPr>
-        <w:spacing w:after="100"/>
+        <w:spacing w:after="100" w:line="240" w:lineRule="auto"/>
         <w:ind w:left="173"/>
       </w:pPr>
       <w:r>
@@ -1270,7 +1270,7 @@
     </w:p>
     <w:p>
       <w:pPr>
-        <w:spacing w:after="20"/>
+        <w:spacing w:after="20" w:line="240" w:lineRule="auto"/>
         <w:ind w:left="173" w:hanging="173"/>
       </w:pPr>
       <w:r>
@@ -1290,7 +1290,7 @@
     </w:p>
     <w:p>
       <w:pPr>
-        <w:spacing w:after="20"/>
+        <w:spacing w:after="20" w:line="240" w:lineRule="auto"/>
         <w:ind w:left="173"/>
       </w:pPr>
       <w:r>
@@ -1302,7 +1302,7 @@
     </w:p>
     <w:p>
       <w:pPr>
-        <w:spacing w:after="100"/>
+        <w:spacing w:after="100" w:line="240" w:lineRule="auto"/>
         <w:ind w:left="173"/>
       </w:pPr>
       <w:r>
@@ -1336,7 +1336,7 @@
     </w:p>
     <w:p>
       <w:pPr>
-        <w:spacing w:after="20"/>
+        <w:spacing w:after="20" w:line="240" w:lineRule="auto"/>
         <w:ind w:left="173" w:hanging="173"/>
       </w:pPr>
       <w:r>
@@ -1356,7 +1356,7 @@
     </w:p>
     <w:p>
       <w:pPr>
-        <w:spacing w:after="20"/>
+        <w:spacing w:after="20" w:line="240" w:lineRule="auto"/>
         <w:ind w:left="173"/>
       </w:pPr>
       <w:r>
@@ -1368,7 +1368,7 @@
     </w:p>
     <w:p>
       <w:pPr>
-        <w:spacing w:after="100"/>
+        <w:spacing w:after="100" w:line="240" w:lineRule="auto"/>
         <w:ind w:left="173"/>
       </w:pPr>
       <w:r>
@@ -1402,7 +1402,7 @@
     </w:p>
     <w:p>
       <w:pPr>
-        <w:spacing w:after="20"/>
+        <w:spacing w:after="20" w:line="240" w:lineRule="auto"/>
         <w:ind w:left="173" w:hanging="173"/>
       </w:pPr>
       <w:r>
@@ -1422,7 +1422,7 @@
     </w:p>
     <w:p>
       <w:pPr>
-        <w:spacing w:after="20"/>
+        <w:spacing w:after="20" w:line="240" w:lineRule="auto"/>
         <w:ind w:left="173"/>
       </w:pPr>
       <w:r>
@@ -1434,7 +1434,7 @@
     </w:p>
     <w:p>
       <w:pPr>
-        <w:spacing w:after="100"/>
+        <w:spacing w:after="100" w:line="240" w:lineRule="auto"/>
         <w:ind w:left="173"/>
       </w:pPr>
       <w:r>
@@ -1468,7 +1468,7 @@
     </w:p>
     <w:p>
       <w:pPr>
-        <w:spacing w:after="20"/>
+        <w:spacing w:after="20" w:line="240" w:lineRule="auto"/>
         <w:ind w:left="173" w:hanging="173"/>
       </w:pPr>
       <w:r>
@@ -1488,7 +1488,7 @@
     </w:p>
     <w:p>
       <w:pPr>
-        <w:spacing w:after="20"/>
+        <w:spacing w:after="20" w:line="240" w:lineRule="auto"/>
         <w:ind w:left="173"/>
       </w:pPr>
       <w:r>
@@ -1500,7 +1500,7 @@
     </w:p>
     <w:p>
       <w:pPr>
-        <w:spacing w:after="100"/>
+        <w:spacing w:after="100" w:line="240" w:lineRule="auto"/>
         <w:ind w:left="173"/>
       </w:pPr>
       <w:r>
@@ -1561,7 +1561,7 @@
     </w:p>
     <w:p>
       <w:pPr>
-        <w:spacing w:after="20"/>
+        <w:spacing w:after="20" w:line="240" w:lineRule="auto"/>
         <w:ind w:left="173" w:hanging="173"/>
       </w:pPr>
       <w:r>
@@ -1581,7 +1581,7 @@
     </w:p>
     <w:p>
       <w:pPr>
-        <w:spacing w:after="20"/>
+        <w:spacing w:after="20" w:line="240" w:lineRule="auto"/>
         <w:ind w:left="173"/>
       </w:pPr>
       <w:r>
@@ -1593,7 +1593,7 @@
     </w:p>
     <w:p>
       <w:pPr>
-        <w:spacing w:after="100"/>
+        <w:spacing w:after="100" w:line="240" w:lineRule="auto"/>
         <w:ind w:left="173"/>
       </w:pPr>
       <w:r>
@@ -1627,7 +1627,7 @@
     </w:p>
     <w:p>
       <w:pPr>
-        <w:spacing w:after="20"/>
+        <w:spacing w:after="20" w:line="240" w:lineRule="auto"/>
         <w:ind w:left="173" w:hanging="173"/>
       </w:pPr>
       <w:r>
@@ -1647,7 +1647,7 @@
     </w:p>
     <w:p>
       <w:pPr>
-        <w:spacing w:after="20"/>
+        <w:spacing w:after="20" w:line="240" w:lineRule="auto"/>
         <w:ind w:left="173"/>
       </w:pPr>
       <w:r>
@@ -1659,7 +1659,7 @@
     </w:p>
     <w:p>
       <w:pPr>
-        <w:spacing w:after="100"/>
+        <w:spacing w:after="100" w:line="240" w:lineRule="auto"/>
         <w:ind w:left="173"/>
       </w:pPr>
       <w:r>
@@ -1693,7 +1693,7 @@
     </w:p>
     <w:p>
       <w:pPr>
-        <w:spacing w:after="20"/>
+        <w:spacing w:after="20" w:line="240" w:lineRule="auto"/>
         <w:ind w:left="173" w:hanging="173"/>
       </w:pPr>
       <w:r>
@@ -1713,7 +1713,7 @@
     </w:p>
     <w:p>
       <w:pPr>
-        <w:spacing w:after="20"/>
+        <w:spacing w:after="20" w:line="240" w:lineRule="auto"/>
         <w:ind w:left="173"/>
       </w:pPr>
       <w:r>
@@ -1725,7 +1725,7 @@
     </w:p>
     <w:p>
       <w:pPr>
-        <w:spacing w:after="100"/>
+        <w:spacing w:after="100" w:line="240" w:lineRule="auto"/>
         <w:ind w:left="173"/>
       </w:pPr>
       <w:r>
@@ -1759,7 +1759,7 @@
     </w:p>
     <w:p>
       <w:pPr>
-        <w:spacing w:after="20"/>
+        <w:spacing w:after="20" w:line="240" w:lineRule="auto"/>
         <w:ind w:left="173" w:hanging="173"/>
       </w:pPr>
       <w:r>
@@ -1779,7 +1779,7 @@
     </w:p>
     <w:p>
       <w:pPr>
-        <w:spacing w:after="20"/>
+        <w:spacing w:after="20" w:line="240" w:lineRule="auto"/>
         <w:ind w:left="173"/>
       </w:pPr>
       <w:r>
@@ -1791,7 +1791,7 @@
     </w:p>
     <w:p>
       <w:pPr>
-        <w:spacing w:after="100"/>
+        <w:spacing w:after="100" w:line="240" w:lineRule="auto"/>
         <w:ind w:left="173"/>
       </w:pPr>
       <w:r>
@@ -1825,7 +1825,7 @@
     </w:p>
     <w:p>
       <w:pPr>
-        <w:spacing w:after="20"/>
+        <w:spacing w:after="20" w:line="240" w:lineRule="auto"/>
         <w:ind w:left="173" w:hanging="173"/>
       </w:pPr>
       <w:r>
@@ -1845,7 +1845,7 @@
     </w:p>
     <w:p>
       <w:pPr>
-        <w:spacing w:after="20"/>
+        <w:spacing w:after="20" w:line="240" w:lineRule="auto"/>
         <w:ind w:left="173"/>
       </w:pPr>
       <w:r>
@@ -1857,7 +1857,7 @@
     </w:p>
     <w:p>
       <w:pPr>
-        <w:spacing w:after="100"/>
+        <w:spacing w:after="100" w:line="240" w:lineRule="auto"/>
         <w:ind w:left="173"/>
       </w:pPr>
       <w:r>
@@ -1918,7 +1918,7 @@
     </w:p>
     <w:p>
       <w:pPr>
-        <w:spacing w:after="20"/>
+        <w:spacing w:after="20" w:line="240" w:lineRule="auto"/>
         <w:ind w:left="173" w:hanging="173"/>
       </w:pPr>
       <w:r>
@@ -1938,7 +1938,7 @@
     </w:p>
     <w:p>
       <w:pPr>
-        <w:spacing w:after="20"/>
+        <w:spacing w:after="20" w:line="240" w:lineRule="auto"/>
         <w:ind w:left="173"/>
       </w:pPr>
       <w:r>
@@ -1950,7 +1950,7 @@
     </w:p>
     <w:p>
       <w:pPr>
-        <w:spacing w:after="100"/>
+        <w:spacing w:after="100" w:line="240" w:lineRule="auto"/>
         <w:ind w:left="173"/>
       </w:pPr>
       <w:r>
@@ -1977,7 +1977,7 @@
     </w:p>
     <w:p>
       <w:pPr>
-        <w:spacing w:after="20"/>
+        <w:spacing w:after="20" w:line="240" w:lineRule="auto"/>
         <w:ind w:left="173" w:hanging="173"/>
       </w:pPr>
       <w:r>
@@ -1997,7 +1997,7 @@
     </w:p>
     <w:p>
       <w:pPr>
-        <w:spacing w:after="20"/>
+        <w:spacing w:after="20" w:line="240" w:lineRule="auto"/>
         <w:ind w:left="173"/>
       </w:pPr>
       <w:r>
@@ -2009,7 +2009,7 @@
     </w:p>
     <w:p>
       <w:pPr>
-        <w:spacing w:after="100"/>
+        <w:spacing w:after="100" w:line="240" w:lineRule="auto"/>
         <w:ind w:left="173"/>
       </w:pPr>
       <w:r>

</xml_diff>

<commit_message>
Update MICCAI DS Springer LNCS 16489 in publication masters
</commit_message>
<xml_diff>
--- a/profile_private/Mineo_Raffaele_PublicationsList.docx
+++ b/profile_private/Mineo_Raffaele_PublicationsList.docx
@@ -1926,14 +1926,13 @@
           <w:b/>
           <w:color w:val="C98C43"/>
         </w:rPr>
-        <w:t xml:space="preserve">2026 - </w:t>
+        <w:t>2027 - Advancing Healthcare with Multimodal AI: Enhanced Diagnosis, Cognitive Monitoring, and Inclusive Medical Communication</w:t>
       </w:r>
       <w:r>
         <w:rPr>
           <w:b/>
           <w:color w:val="0B1F33"/>
         </w:rPr>
-        <w:t>Advancing Healthcare with Multimodal AI: Enhanced Diagnosis, Cognitive Monitoring, and Inclusive Medical Communication</w:t>
       </w:r>
     </w:p>
     <w:p>
@@ -1958,21 +1957,19 @@
           <w:i/>
           <w:sz w:val="17"/>
         </w:rPr>
-        <w:t>International Conference on Medical Image Computing and Computer-Assisted Intervention</w:t>
+        <w:t>Medical Image Computing and Computer Assisted Intervention -- MICCAI 2025 Doctoral Symposium; Lecture Notes in Computer Science, vol. 16489 (Springer) - Conference - MICCAI DS</w:t>
       </w:r>
       <w:r>
         <w:rPr>
           <w:color w:val="5A646E"/>
           <w:sz w:val="17"/>
         </w:rPr>
-        <w:t xml:space="preserve"> - Conference</w:t>
       </w:r>
       <w:r>
         <w:rPr>
           <w:color w:val="5A646E"/>
           <w:sz w:val="16"/>
         </w:rPr>
-        <w:t xml:space="preserve"> - MICCAI</w:t>
       </w:r>
     </w:p>
     <w:p>

</xml_diff>